<commit_message>
AI foundation model choice and false positive variation in Anti Money Laundering transaction screening
</commit_message>
<xml_diff>
--- a/manuscript/COVER_LETTER.docx
+++ b/manuscript/COVER_LETTER.docx
@@ -272,7 +272,7 @@
         </m:r>
       </m:oMath>
       <w:r>
-        <w:t xml:space="preserve">, McNemar’s exact test with Bonferroni correction, Wilson score intervals, and a cluster bootstrap), non-LLM rules and supervised baselines provide a reference frame, and a deterministic, offline reproducibility capsule (Code Ocean DOI</w:t>
+        <w:t xml:space="preserve">, McNemar’s exact test with Bonferroni correction, Wilson score intervals, and a cluster bootstrap), non-LLM rules and supervised baselines provide a reference frame, and a deterministic, offline reproducibility archive (public GitHub repository,</w:t>
       </w:r>
       <w:r>
         <w:t xml:space="preserve"> </w:t>
@@ -282,11 +282,23 @@
           <w:rPr>
             <w:rStyle w:val="Hyperlink"/>
           </w:rPr>
-          <w:t xml:space="preserve">10.24433/CO.4804007.v1</w:t>
+          <w:t xml:space="preserve">https://github.com/samirrc2/ai-foundation-model-aml-false-positives</w:t>
         </w:r>
       </w:hyperlink>
       <w:r>
-        <w:t xml:space="preserve">; MIT license) regenerates every reported number, table, and figure byte-for-byte. The study uses only synthetic transaction data, involves no human or animal subjects, and discloses its use of generative-AI assistance in the Declarations.</w:t>
+        <w:t xml:space="preserve">; MIT license), documented in</w:t>
+      </w:r>
+      <w:r>
+        <w:t xml:space="preserve"> </w:t>
+      </w:r>
+      <w:r>
+        <w:rPr>
+          <w:rStyle w:val="VerbatimChar"/>
+        </w:rPr>
+        <w:t xml:space="preserve">REPRODUCIBILITY_DOCUMENTATION.pdf</w:t>
+      </w:r>
+      <w:r>
+        <w:t xml:space="preserve">, regenerates every reported number, table, and figure byte-for-byte. The study uses only synthetic transaction data, involves no human or animal subjects, and discloses its use of generative-AI assistance in the Declarations.</w:t>
       </w:r>
     </w:p>
     <w:p>

</xml_diff>